<commit_message>
germination methodology details into supplementary
</commit_message>
<xml_diff>
--- a/results/Supplementary/Methods details.docx
+++ b/results/Supplementary/Methods details.docx
@@ -6,34 +6,18 @@
       <w:pPr>
         <w:pStyle w:val="Ttulo1"/>
         <w:rPr>
-          <w:lang w:val="es-ES"/>
+          <w:lang w:val="en-GB"/>
         </w:rPr>
       </w:pPr>
-      <w:proofErr w:type="spellStart"/>
-      <w:r>
-        <w:rPr>
-          <w:lang w:val="es-ES"/>
-        </w:rPr>
-        <w:t>Methods</w:t>
-      </w:r>
-      <w:proofErr w:type="spellEnd"/>
-      <w:r>
-        <w:rPr>
-          <w:lang w:val="es-ES"/>
-        </w:rPr>
-        <w:t xml:space="preserve"> </w:t>
-      </w:r>
-      <w:proofErr w:type="spellStart"/>
-      <w:r>
-        <w:rPr>
-          <w:lang w:val="es-ES"/>
-        </w:rPr>
-        <w:t>details</w:t>
-      </w:r>
-      <w:proofErr w:type="spellEnd"/>
-      <w:r>
-        <w:rPr>
-          <w:lang w:val="es-ES"/>
+      <w:r>
+        <w:rPr>
+          <w:lang w:val="en-GB"/>
+        </w:rPr>
+        <w:t>Methods details</w:t>
+      </w:r>
+      <w:r>
+        <w:rPr>
+          <w:lang w:val="en-GB"/>
         </w:rPr>
         <w:t xml:space="preserve"> </w:t>
       </w:r>
@@ -42,50 +26,22 @@
       <w:pPr>
         <w:pStyle w:val="Ttulo2"/>
         <w:rPr>
-          <w:lang w:val="es-ES"/>
+          <w:lang w:val="en-GB"/>
         </w:rPr>
       </w:pPr>
       <w:proofErr w:type="spellStart"/>
       <w:r>
         <w:rPr>
-          <w:lang w:val="es-ES"/>
+          <w:lang w:val="en-GB"/>
         </w:rPr>
         <w:t>Pretreatment</w:t>
       </w:r>
       <w:proofErr w:type="spellEnd"/>
       <w:r>
         <w:rPr>
-          <w:lang w:val="es-ES"/>
-        </w:rPr>
-        <w:t xml:space="preserve"> (</w:t>
-      </w:r>
-      <w:proofErr w:type="spellStart"/>
-      <w:r>
-        <w:rPr>
-          <w:lang w:val="es-ES"/>
-        </w:rPr>
-        <w:t>cold</w:t>
-      </w:r>
-      <w:proofErr w:type="spellEnd"/>
-      <w:r>
-        <w:rPr>
-          <w:lang w:val="es-ES"/>
-        </w:rPr>
-        <w:t xml:space="preserve"> </w:t>
-      </w:r>
-      <w:proofErr w:type="spellStart"/>
-      <w:r>
-        <w:rPr>
-          <w:lang w:val="es-ES"/>
-        </w:rPr>
-        <w:t>stratification</w:t>
-      </w:r>
-      <w:proofErr w:type="spellEnd"/>
-      <w:r>
-        <w:rPr>
-          <w:lang w:val="es-ES"/>
-        </w:rPr>
-        <w:t>)</w:t>
+          <w:lang w:val="en-GB"/>
+        </w:rPr>
+        <w:t xml:space="preserve"> (cold stratification)</w:t>
       </w:r>
     </w:p>
     <w:p>
@@ -1201,21 +1157,413 @@
         <w:rPr>
           <w:rFonts w:cstheme="minorHAnsi"/>
         </w:rPr>
-        <w:t>The</w:t>
-      </w:r>
-      <w:proofErr w:type="spellEnd"/>
-      <w:r>
-        <w:rPr>
-          <w:rFonts w:cstheme="minorHAnsi"/>
-        </w:rPr>
-        <w:t xml:space="preserve"> </w:t>
-      </w:r>
-      <w:proofErr w:type="spellStart"/>
-      <w:r>
-        <w:rPr>
-          <w:rFonts w:cstheme="minorHAnsi"/>
-        </w:rPr>
-        <w:t>three</w:t>
+        <w:t>Leaves</w:t>
+      </w:r>
+      <w:proofErr w:type="spellEnd"/>
+      <w:r>
+        <w:rPr>
+          <w:rFonts w:cstheme="minorHAnsi"/>
+        </w:rPr>
+        <w:t xml:space="preserve"> </w:t>
+      </w:r>
+      <w:proofErr w:type="spellStart"/>
+      <w:r>
+        <w:rPr>
+          <w:rFonts w:cstheme="minorHAnsi"/>
+        </w:rPr>
+        <w:t>were</w:t>
+      </w:r>
+      <w:proofErr w:type="spellEnd"/>
+      <w:r>
+        <w:rPr>
+          <w:rFonts w:cstheme="minorHAnsi"/>
+        </w:rPr>
+        <w:t xml:space="preserve"> </w:t>
+      </w:r>
+      <w:proofErr w:type="spellStart"/>
+      <w:r>
+        <w:rPr>
+          <w:rFonts w:cstheme="minorHAnsi"/>
+        </w:rPr>
+        <w:t>collected</w:t>
+      </w:r>
+      <w:proofErr w:type="spellEnd"/>
+      <w:r>
+        <w:rPr>
+          <w:rFonts w:cstheme="minorHAnsi"/>
+        </w:rPr>
+        <w:t xml:space="preserve"> </w:t>
+      </w:r>
+      <w:proofErr w:type="spellStart"/>
+      <w:r>
+        <w:rPr>
+          <w:rFonts w:cstheme="minorHAnsi"/>
+        </w:rPr>
+        <w:t>early</w:t>
+      </w:r>
+      <w:proofErr w:type="spellEnd"/>
+      <w:r>
+        <w:rPr>
+          <w:rFonts w:cstheme="minorHAnsi"/>
+        </w:rPr>
+        <w:t xml:space="preserve"> in </w:t>
+      </w:r>
+      <w:proofErr w:type="spellStart"/>
+      <w:r>
+        <w:rPr>
+          <w:rFonts w:cstheme="minorHAnsi"/>
+        </w:rPr>
+        <w:t>the</w:t>
+      </w:r>
+      <w:proofErr w:type="spellEnd"/>
+      <w:r>
+        <w:rPr>
+          <w:rFonts w:cstheme="minorHAnsi"/>
+        </w:rPr>
+        <w:t xml:space="preserve"> </w:t>
+      </w:r>
+      <w:proofErr w:type="spellStart"/>
+      <w:r>
+        <w:rPr>
+          <w:rFonts w:cstheme="minorHAnsi"/>
+        </w:rPr>
+        <w:t>day</w:t>
+      </w:r>
+      <w:proofErr w:type="spellEnd"/>
+      <w:r>
+        <w:rPr>
+          <w:rFonts w:cstheme="minorHAnsi"/>
+        </w:rPr>
+        <w:t xml:space="preserve"> in </w:t>
+      </w:r>
+      <w:proofErr w:type="spellStart"/>
+      <w:r>
+        <w:rPr>
+          <w:rFonts w:cstheme="minorHAnsi"/>
+        </w:rPr>
+        <w:t>the</w:t>
+      </w:r>
+      <w:proofErr w:type="spellEnd"/>
+      <w:r>
+        <w:rPr>
+          <w:rFonts w:cstheme="minorHAnsi"/>
+        </w:rPr>
+        <w:t xml:space="preserve"> </w:t>
+      </w:r>
+      <w:proofErr w:type="spellStart"/>
+      <w:r>
+        <w:rPr>
+          <w:rFonts w:cstheme="minorHAnsi"/>
+        </w:rPr>
+        <w:t>field</w:t>
+      </w:r>
+      <w:proofErr w:type="spellEnd"/>
+      <w:r>
+        <w:rPr>
+          <w:rFonts w:cstheme="minorHAnsi"/>
+        </w:rPr>
+        <w:t xml:space="preserve">, </w:t>
+      </w:r>
+      <w:proofErr w:type="spellStart"/>
+      <w:r>
+        <w:rPr>
+          <w:rFonts w:cstheme="minorHAnsi"/>
+        </w:rPr>
+        <w:t>kept</w:t>
+      </w:r>
+      <w:proofErr w:type="spellEnd"/>
+      <w:r>
+        <w:rPr>
+          <w:rFonts w:cstheme="minorHAnsi"/>
+        </w:rPr>
+        <w:t xml:space="preserve"> in </w:t>
+      </w:r>
+      <w:proofErr w:type="spellStart"/>
+      <w:r>
+        <w:rPr>
+          <w:rFonts w:cstheme="minorHAnsi"/>
+        </w:rPr>
+        <w:t>sealed</w:t>
+      </w:r>
+      <w:proofErr w:type="spellEnd"/>
+      <w:r>
+        <w:rPr>
+          <w:rFonts w:cstheme="minorHAnsi"/>
+        </w:rPr>
+        <w:t xml:space="preserve"> </w:t>
+      </w:r>
+      <w:proofErr w:type="spellStart"/>
+      <w:r>
+        <w:rPr>
+          <w:rFonts w:cstheme="minorHAnsi"/>
+        </w:rPr>
+        <w:t>plastic</w:t>
+      </w:r>
+      <w:proofErr w:type="spellEnd"/>
+      <w:r>
+        <w:rPr>
+          <w:rFonts w:cstheme="minorHAnsi"/>
+        </w:rPr>
+        <w:t xml:space="preserve"> </w:t>
+      </w:r>
+      <w:proofErr w:type="spellStart"/>
+      <w:r>
+        <w:rPr>
+          <w:rFonts w:cstheme="minorHAnsi"/>
+        </w:rPr>
+        <w:t>bags</w:t>
+      </w:r>
+      <w:proofErr w:type="spellEnd"/>
+      <w:r>
+        <w:rPr>
+          <w:rFonts w:cstheme="minorHAnsi"/>
+        </w:rPr>
+        <w:t xml:space="preserve"> </w:t>
+      </w:r>
+      <w:proofErr w:type="spellStart"/>
+      <w:r>
+        <w:rPr>
+          <w:rFonts w:cstheme="minorHAnsi"/>
+        </w:rPr>
+        <w:t>with</w:t>
+      </w:r>
+      <w:proofErr w:type="spellEnd"/>
+      <w:r>
+        <w:rPr>
+          <w:rFonts w:cstheme="minorHAnsi"/>
+        </w:rPr>
+        <w:t xml:space="preserve"> </w:t>
+      </w:r>
+      <w:proofErr w:type="spellStart"/>
+      <w:r>
+        <w:rPr>
+          <w:rFonts w:cstheme="minorHAnsi"/>
+        </w:rPr>
+        <w:t>moist</w:t>
+      </w:r>
+      <w:proofErr w:type="spellEnd"/>
+      <w:r>
+        <w:rPr>
+          <w:rFonts w:cstheme="minorHAnsi"/>
+        </w:rPr>
+        <w:t xml:space="preserve"> paper </w:t>
+      </w:r>
+      <w:proofErr w:type="spellStart"/>
+      <w:r>
+        <w:rPr>
+          <w:rFonts w:cstheme="minorHAnsi"/>
+        </w:rPr>
+        <w:t>until</w:t>
+      </w:r>
+      <w:proofErr w:type="spellEnd"/>
+      <w:r>
+        <w:rPr>
+          <w:rFonts w:cstheme="minorHAnsi"/>
+        </w:rPr>
+        <w:t xml:space="preserve"> </w:t>
+      </w:r>
+      <w:proofErr w:type="spellStart"/>
+      <w:r>
+        <w:rPr>
+          <w:rFonts w:cstheme="minorHAnsi"/>
+        </w:rPr>
+        <w:t>further</w:t>
+      </w:r>
+      <w:proofErr w:type="spellEnd"/>
+      <w:r>
+        <w:rPr>
+          <w:rFonts w:cstheme="minorHAnsi"/>
+        </w:rPr>
+        <w:t xml:space="preserve"> </w:t>
+      </w:r>
+      <w:proofErr w:type="spellStart"/>
+      <w:r>
+        <w:rPr>
+          <w:rFonts w:cstheme="minorHAnsi"/>
+        </w:rPr>
+        <w:t>processing</w:t>
+      </w:r>
+      <w:proofErr w:type="spellEnd"/>
+      <w:r>
+        <w:rPr>
+          <w:rFonts w:cstheme="minorHAnsi"/>
+        </w:rPr>
+        <w:t xml:space="preserve"> in </w:t>
+      </w:r>
+      <w:proofErr w:type="spellStart"/>
+      <w:r>
+        <w:rPr>
+          <w:rFonts w:cstheme="minorHAnsi"/>
+        </w:rPr>
+        <w:t>the</w:t>
+      </w:r>
+      <w:proofErr w:type="spellEnd"/>
+      <w:r>
+        <w:rPr>
+          <w:rFonts w:cstheme="minorHAnsi"/>
+        </w:rPr>
+        <w:t xml:space="preserve"> </w:t>
+      </w:r>
+      <w:proofErr w:type="spellStart"/>
+      <w:r>
+        <w:rPr>
+          <w:rFonts w:cstheme="minorHAnsi"/>
+        </w:rPr>
+        <w:t>laboratory</w:t>
+      </w:r>
+      <w:proofErr w:type="spellEnd"/>
+      <w:r>
+        <w:rPr>
+          <w:rFonts w:cstheme="minorHAnsi"/>
+        </w:rPr>
+        <w:t xml:space="preserve">. </w:t>
+      </w:r>
+      <w:proofErr w:type="spellStart"/>
+      <w:r>
+        <w:rPr>
+          <w:rFonts w:cstheme="minorHAnsi"/>
+        </w:rPr>
+        <w:t>Fresh</w:t>
+      </w:r>
+      <w:proofErr w:type="spellEnd"/>
+      <w:r>
+        <w:rPr>
+          <w:rFonts w:cstheme="minorHAnsi"/>
+        </w:rPr>
+        <w:t xml:space="preserve"> </w:t>
+      </w:r>
+      <w:proofErr w:type="spellStart"/>
+      <w:r>
+        <w:rPr>
+          <w:rFonts w:cstheme="minorHAnsi"/>
+        </w:rPr>
+        <w:t>weight</w:t>
+      </w:r>
+      <w:proofErr w:type="spellEnd"/>
+      <w:r>
+        <w:rPr>
+          <w:rFonts w:cstheme="minorHAnsi"/>
+        </w:rPr>
+        <w:t xml:space="preserve"> </w:t>
+      </w:r>
+      <w:proofErr w:type="spellStart"/>
+      <w:r>
+        <w:rPr>
+          <w:rFonts w:cstheme="minorHAnsi"/>
+        </w:rPr>
+        <w:t>was</w:t>
+      </w:r>
+      <w:proofErr w:type="spellEnd"/>
+      <w:r>
+        <w:rPr>
+          <w:rFonts w:cstheme="minorHAnsi"/>
+        </w:rPr>
+        <w:t xml:space="preserve"> </w:t>
+      </w:r>
+      <w:proofErr w:type="spellStart"/>
+      <w:r>
+        <w:rPr>
+          <w:rFonts w:cstheme="minorHAnsi"/>
+        </w:rPr>
+        <w:t>measured</w:t>
+      </w:r>
+      <w:proofErr w:type="spellEnd"/>
+      <w:r>
+        <w:rPr>
+          <w:rFonts w:cstheme="minorHAnsi"/>
+        </w:rPr>
+        <w:t xml:space="preserve"> (</w:t>
+      </w:r>
+      <w:proofErr w:type="spellStart"/>
+      <w:r>
+        <w:rPr>
+          <w:rFonts w:cstheme="minorHAnsi"/>
+        </w:rPr>
+        <w:t>Mettler</w:t>
+      </w:r>
+      <w:proofErr w:type="spellEnd"/>
+      <w:r>
+        <w:rPr>
+          <w:rFonts w:cstheme="minorHAnsi"/>
+        </w:rPr>
+        <w:t xml:space="preserve"> Toledo, New </w:t>
+      </w:r>
+      <w:proofErr w:type="spellStart"/>
+      <w:r>
+        <w:rPr>
+          <w:rFonts w:cstheme="minorHAnsi"/>
+        </w:rPr>
+        <w:t>classic</w:t>
+      </w:r>
+      <w:proofErr w:type="spellEnd"/>
+      <w:r>
+        <w:rPr>
+          <w:rFonts w:cstheme="minorHAnsi"/>
+        </w:rPr>
+        <w:t xml:space="preserve"> SG – Model ML1052E/01, </w:t>
+      </w:r>
+      <w:proofErr w:type="spellStart"/>
+      <w:r>
+        <w:rPr>
+          <w:rFonts w:cstheme="minorHAnsi"/>
+        </w:rPr>
+        <w:t>precision</w:t>
+      </w:r>
+      <w:proofErr w:type="spellEnd"/>
+      <w:r>
+        <w:rPr>
+          <w:rFonts w:cstheme="minorHAnsi"/>
+        </w:rPr>
+        <w:t xml:space="preserve"> 0.1 mg), </w:t>
+      </w:r>
+      <w:proofErr w:type="spellStart"/>
+      <w:r>
+        <w:rPr>
+          <w:rFonts w:cstheme="minorHAnsi"/>
+        </w:rPr>
+        <w:t>removing</w:t>
+      </w:r>
+      <w:proofErr w:type="spellEnd"/>
+      <w:r>
+        <w:rPr>
+          <w:rFonts w:cstheme="minorHAnsi"/>
+        </w:rPr>
+        <w:t xml:space="preserve"> any visible </w:t>
+      </w:r>
+      <w:proofErr w:type="spellStart"/>
+      <w:r>
+        <w:rPr>
+          <w:rFonts w:cstheme="minorHAnsi"/>
+        </w:rPr>
+        <w:t>droplets</w:t>
+      </w:r>
+      <w:proofErr w:type="spellEnd"/>
+      <w:r>
+        <w:rPr>
+          <w:rFonts w:cstheme="minorHAnsi"/>
+        </w:rPr>
+        <w:t xml:space="preserve"> of </w:t>
+      </w:r>
+      <w:proofErr w:type="spellStart"/>
+      <w:r>
+        <w:rPr>
+          <w:rFonts w:cstheme="minorHAnsi"/>
+        </w:rPr>
+        <w:t>water</w:t>
+      </w:r>
+      <w:proofErr w:type="spellEnd"/>
+      <w:r>
+        <w:rPr>
+          <w:rFonts w:cstheme="minorHAnsi"/>
+        </w:rPr>
+        <w:t xml:space="preserve">, </w:t>
+      </w:r>
+      <w:proofErr w:type="spellStart"/>
+      <w:r>
+        <w:rPr>
+          <w:rFonts w:cstheme="minorHAnsi"/>
+        </w:rPr>
+        <w:t>then</w:t>
       </w:r>
       <w:proofErr w:type="spellEnd"/>
       <w:r>
@@ -1243,20 +1591,6 @@
         <w:rPr>
           <w:rFonts w:cstheme="minorHAnsi"/>
         </w:rPr>
-        <w:t>traits</w:t>
-      </w:r>
-      <w:proofErr w:type="spellEnd"/>
-      <w:r>
-        <w:rPr>
-          <w:rFonts w:cstheme="minorHAnsi"/>
-        </w:rPr>
-        <w:t xml:space="preserve"> </w:t>
-      </w:r>
-      <w:proofErr w:type="spellStart"/>
-      <w:r>
-        <w:rPr>
-          <w:rFonts w:cstheme="minorHAnsi"/>
-        </w:rPr>
         <w:t>were</w:t>
       </w:r>
       <w:proofErr w:type="spellEnd"/>
@@ -1271,35 +1605,118 @@
         <w:rPr>
           <w:rFonts w:cstheme="minorHAnsi"/>
         </w:rPr>
-        <w:t>calculated</w:t>
-      </w:r>
-      <w:proofErr w:type="spellEnd"/>
-      <w:r>
-        <w:rPr>
-          <w:rFonts w:cstheme="minorHAnsi"/>
-        </w:rPr>
-        <w:t xml:space="preserve"> </w:t>
-      </w:r>
-      <w:proofErr w:type="spellStart"/>
-      <w:r>
-        <w:rPr>
-          <w:rFonts w:cstheme="minorHAnsi"/>
-        </w:rPr>
-        <w:t>from</w:t>
-      </w:r>
-      <w:proofErr w:type="spellEnd"/>
-      <w:r>
-        <w:rPr>
-          <w:rFonts w:cstheme="minorHAnsi"/>
-        </w:rPr>
-        <w:t xml:space="preserve"> </w:t>
-      </w:r>
-      <w:proofErr w:type="spellStart"/>
-      <w:r>
-        <w:rPr>
-          <w:rFonts w:cstheme="minorHAnsi"/>
-        </w:rPr>
-        <w:t>two</w:t>
+        <w:t>scanned</w:t>
+      </w:r>
+      <w:proofErr w:type="spellEnd"/>
+      <w:r>
+        <w:rPr>
+          <w:rFonts w:cstheme="minorHAnsi"/>
+        </w:rPr>
+        <w:t xml:space="preserve"> </w:t>
+      </w:r>
+      <w:proofErr w:type="spellStart"/>
+      <w:r>
+        <w:rPr>
+          <w:rFonts w:cstheme="minorHAnsi"/>
+        </w:rPr>
+        <w:t>with</w:t>
+      </w:r>
+      <w:proofErr w:type="spellEnd"/>
+      <w:r>
+        <w:rPr>
+          <w:rFonts w:cstheme="minorHAnsi"/>
+        </w:rPr>
+        <w:t xml:space="preserve"> Epson </w:t>
+      </w:r>
+      <w:proofErr w:type="spellStart"/>
+      <w:r>
+        <w:rPr>
+          <w:rFonts w:cstheme="minorHAnsi"/>
+        </w:rPr>
+        <w:t>Canon</w:t>
+      </w:r>
+      <w:proofErr w:type="spellEnd"/>
+      <w:r>
+        <w:rPr>
+          <w:rFonts w:cstheme="minorHAnsi"/>
+        </w:rPr>
+        <w:t xml:space="preserve"> </w:t>
+      </w:r>
+      <w:proofErr w:type="spellStart"/>
+      <w:r>
+        <w:rPr>
+          <w:rFonts w:cstheme="minorHAnsi"/>
+        </w:rPr>
+        <w:t>scanner</w:t>
+      </w:r>
+      <w:proofErr w:type="spellEnd"/>
+      <w:r>
+        <w:rPr>
+          <w:rFonts w:cstheme="minorHAnsi"/>
+        </w:rPr>
+        <w:t xml:space="preserve"> (</w:t>
+      </w:r>
+      <w:r>
+        <w:rPr>
+          <w:rFonts w:cstheme="minorHAnsi"/>
+          <w:highlight w:val="yellow"/>
+        </w:rPr>
+        <w:t>REF</w:t>
+      </w:r>
+      <w:r>
+        <w:rPr>
+          <w:rFonts w:cstheme="minorHAnsi"/>
+        </w:rPr>
+        <w:t xml:space="preserve">) </w:t>
+      </w:r>
+      <w:proofErr w:type="spellStart"/>
+      <w:r>
+        <w:rPr>
+          <w:rFonts w:cstheme="minorHAnsi"/>
+        </w:rPr>
+        <w:t>at</w:t>
+      </w:r>
+      <w:proofErr w:type="spellEnd"/>
+      <w:r>
+        <w:rPr>
+          <w:rFonts w:cstheme="minorHAnsi"/>
+        </w:rPr>
+        <w:t xml:space="preserve"> 600 </w:t>
+      </w:r>
+      <w:proofErr w:type="spellStart"/>
+      <w:r>
+        <w:rPr>
+          <w:rFonts w:cstheme="minorHAnsi"/>
+        </w:rPr>
+        <w:t>dpi</w:t>
+      </w:r>
+      <w:proofErr w:type="spellEnd"/>
+      <w:r>
+        <w:rPr>
+          <w:rFonts w:cstheme="minorHAnsi"/>
+        </w:rPr>
+        <w:t xml:space="preserve"> </w:t>
+      </w:r>
+      <w:proofErr w:type="spellStart"/>
+      <w:r>
+        <w:rPr>
+          <w:rFonts w:cstheme="minorHAnsi"/>
+        </w:rPr>
+        <w:t>and</w:t>
+      </w:r>
+      <w:proofErr w:type="spellEnd"/>
+      <w:r>
+        <w:rPr>
+          <w:rFonts w:cstheme="minorHAnsi"/>
+        </w:rPr>
+        <w:t xml:space="preserve"> </w:t>
+      </w:r>
+      <w:proofErr w:type="spellStart"/>
+      <w:r>
+        <w:rPr>
+          <w:rFonts w:cstheme="minorHAnsi"/>
+        </w:rPr>
+        <w:t>finally</w:t>
       </w:r>
       <w:proofErr w:type="spellEnd"/>
       <w:r>
@@ -1320,91 +1737,119 @@
         <w:rPr>
           <w:rFonts w:cstheme="minorHAnsi"/>
         </w:rPr>
-        <w:t xml:space="preserve"> of ten individuals of </w:t>
-      </w:r>
-      <w:proofErr w:type="spellStart"/>
-      <w:r>
-        <w:rPr>
-          <w:rFonts w:cstheme="minorHAnsi"/>
-        </w:rPr>
-        <w:t>each</w:t>
-      </w:r>
-      <w:proofErr w:type="spellEnd"/>
-      <w:r>
-        <w:rPr>
-          <w:rFonts w:cstheme="minorHAnsi"/>
-        </w:rPr>
-        <w:t xml:space="preserve"> </w:t>
-      </w:r>
-      <w:proofErr w:type="spellStart"/>
-      <w:r>
-        <w:rPr>
-          <w:rFonts w:cstheme="minorHAnsi"/>
-        </w:rPr>
-        <w:t>species</w:t>
-      </w:r>
-      <w:proofErr w:type="spellEnd"/>
-      <w:r>
-        <w:rPr>
-          <w:rFonts w:cstheme="minorHAnsi"/>
-        </w:rPr>
-        <w:t xml:space="preserve"> </w:t>
-      </w:r>
-      <w:proofErr w:type="spellStart"/>
-      <w:r>
-        <w:rPr>
-          <w:rFonts w:cstheme="minorHAnsi"/>
-        </w:rPr>
-        <w:t>following</w:t>
-      </w:r>
-      <w:proofErr w:type="spellEnd"/>
-      <w:r>
-        <w:rPr>
-          <w:rFonts w:cstheme="minorHAnsi"/>
-        </w:rPr>
-        <w:t xml:space="preserve"> </w:t>
-      </w:r>
-      <w:proofErr w:type="spellStart"/>
-      <w:r>
-        <w:rPr>
-          <w:rFonts w:cstheme="minorHAnsi"/>
-        </w:rPr>
-        <w:t>standard</w:t>
-      </w:r>
-      <w:proofErr w:type="spellEnd"/>
-      <w:r>
-        <w:rPr>
-          <w:rFonts w:cstheme="minorHAnsi"/>
-        </w:rPr>
-        <w:t xml:space="preserve"> </w:t>
-      </w:r>
-      <w:proofErr w:type="spellStart"/>
-      <w:r>
-        <w:rPr>
-          <w:rFonts w:cstheme="minorHAnsi"/>
-        </w:rPr>
-        <w:t>procedures</w:t>
-      </w:r>
-      <w:proofErr w:type="spellEnd"/>
-      <w:r>
-        <w:rPr>
-          <w:rFonts w:cstheme="minorHAnsi"/>
-        </w:rPr>
-        <w:t xml:space="preserve"> (Pérez-</w:t>
-      </w:r>
-      <w:proofErr w:type="spellStart"/>
-      <w:r>
-        <w:rPr>
-          <w:rFonts w:cstheme="minorHAnsi"/>
-        </w:rPr>
-        <w:t>Harguindeguy</w:t>
-      </w:r>
-      <w:proofErr w:type="spellEnd"/>
-      <w:r>
-        <w:rPr>
-          <w:rFonts w:cstheme="minorHAnsi"/>
-        </w:rPr>
-        <w:t xml:space="preserve"> et al. 2016). </w:t>
+        <w:t xml:space="preserve"> </w:t>
+      </w:r>
+      <w:proofErr w:type="spellStart"/>
+      <w:r>
+        <w:rPr>
+          <w:rFonts w:cstheme="minorHAnsi"/>
+        </w:rPr>
+        <w:t>were</w:t>
+      </w:r>
+      <w:proofErr w:type="spellEnd"/>
+      <w:r>
+        <w:rPr>
+          <w:rFonts w:cstheme="minorHAnsi"/>
+        </w:rPr>
+        <w:t xml:space="preserve"> put in </w:t>
+      </w:r>
+      <w:proofErr w:type="spellStart"/>
+      <w:r>
+        <w:rPr>
+          <w:rFonts w:cstheme="minorHAnsi"/>
+        </w:rPr>
+        <w:t>the</w:t>
+      </w:r>
+      <w:proofErr w:type="spellEnd"/>
+      <w:r>
+        <w:rPr>
+          <w:rFonts w:cstheme="minorHAnsi"/>
+        </w:rPr>
+        <w:t xml:space="preserve"> </w:t>
+      </w:r>
+      <w:proofErr w:type="spellStart"/>
+      <w:r>
+        <w:rPr>
+          <w:rFonts w:cstheme="minorHAnsi"/>
+        </w:rPr>
+        <w:t>oven</w:t>
+      </w:r>
+      <w:proofErr w:type="spellEnd"/>
+      <w:r>
+        <w:rPr>
+          <w:rFonts w:cstheme="minorHAnsi"/>
+        </w:rPr>
+        <w:t xml:space="preserve"> </w:t>
+      </w:r>
+      <w:proofErr w:type="spellStart"/>
+      <w:r>
+        <w:rPr>
+          <w:rFonts w:cstheme="minorHAnsi"/>
+        </w:rPr>
+        <w:t>at</w:t>
+      </w:r>
+      <w:proofErr w:type="spellEnd"/>
+      <w:r>
+        <w:rPr>
+          <w:rFonts w:cstheme="minorHAnsi"/>
+        </w:rPr>
+        <w:t xml:space="preserve"> 70ºC for 72h to </w:t>
+      </w:r>
+      <w:proofErr w:type="spellStart"/>
+      <w:r>
+        <w:rPr>
+          <w:rFonts w:cstheme="minorHAnsi"/>
+        </w:rPr>
+        <w:t>lastly</w:t>
+      </w:r>
+      <w:proofErr w:type="spellEnd"/>
+      <w:r>
+        <w:rPr>
+          <w:rFonts w:cstheme="minorHAnsi"/>
+        </w:rPr>
+        <w:t xml:space="preserve"> </w:t>
+      </w:r>
+      <w:proofErr w:type="spellStart"/>
+      <w:r>
+        <w:rPr>
+          <w:rFonts w:cstheme="minorHAnsi"/>
+        </w:rPr>
+        <w:t>measure</w:t>
+      </w:r>
+      <w:proofErr w:type="spellEnd"/>
+      <w:r>
+        <w:rPr>
+          <w:rFonts w:cstheme="minorHAnsi"/>
+        </w:rPr>
+        <w:t xml:space="preserve"> </w:t>
+      </w:r>
+      <w:proofErr w:type="spellStart"/>
+      <w:r>
+        <w:rPr>
+          <w:rFonts w:cstheme="minorHAnsi"/>
+        </w:rPr>
+        <w:t>dry</w:t>
+      </w:r>
+      <w:proofErr w:type="spellEnd"/>
+      <w:r>
+        <w:rPr>
+          <w:rFonts w:cstheme="minorHAnsi"/>
+        </w:rPr>
+        <w:t xml:space="preserve"> </w:t>
+      </w:r>
+      <w:proofErr w:type="spellStart"/>
+      <w:r>
+        <w:rPr>
+          <w:rFonts w:cstheme="minorHAnsi"/>
+        </w:rPr>
+        <w:t>weight</w:t>
+      </w:r>
+      <w:proofErr w:type="spellEnd"/>
+      <w:r>
+        <w:rPr>
+          <w:rFonts w:cstheme="minorHAnsi"/>
+        </w:rPr>
+        <w:t xml:space="preserve">. </w:t>
       </w:r>
       <w:proofErr w:type="spellStart"/>
       <w:r>
@@ -1425,91 +1870,77 @@
         <w:rPr>
           <w:rFonts w:cstheme="minorHAnsi"/>
         </w:rPr>
-        <w:t>were</w:t>
-      </w:r>
-      <w:proofErr w:type="spellEnd"/>
-      <w:r>
-        <w:rPr>
-          <w:rFonts w:cstheme="minorHAnsi"/>
-        </w:rPr>
-        <w:t xml:space="preserve"> </w:t>
-      </w:r>
-      <w:proofErr w:type="spellStart"/>
-      <w:r>
-        <w:rPr>
-          <w:rFonts w:cstheme="minorHAnsi"/>
-        </w:rPr>
-        <w:t>collected</w:t>
-      </w:r>
-      <w:proofErr w:type="spellEnd"/>
-      <w:r>
-        <w:rPr>
-          <w:rFonts w:cstheme="minorHAnsi"/>
-        </w:rPr>
-        <w:t xml:space="preserve"> </w:t>
-      </w:r>
-      <w:proofErr w:type="spellStart"/>
-      <w:r>
-        <w:rPr>
-          <w:rFonts w:cstheme="minorHAnsi"/>
-        </w:rPr>
-        <w:t>early</w:t>
-      </w:r>
-      <w:proofErr w:type="spellEnd"/>
-      <w:r>
-        <w:rPr>
-          <w:rFonts w:cstheme="minorHAnsi"/>
-        </w:rPr>
-        <w:t xml:space="preserve"> in </w:t>
-      </w:r>
-      <w:proofErr w:type="spellStart"/>
-      <w:r>
-        <w:rPr>
-          <w:rFonts w:cstheme="minorHAnsi"/>
-        </w:rPr>
-        <w:t>the</w:t>
-      </w:r>
-      <w:proofErr w:type="spellEnd"/>
-      <w:r>
-        <w:rPr>
-          <w:rFonts w:cstheme="minorHAnsi"/>
-        </w:rPr>
-        <w:t xml:space="preserve"> </w:t>
-      </w:r>
-      <w:proofErr w:type="spellStart"/>
-      <w:r>
-        <w:rPr>
-          <w:rFonts w:cstheme="minorHAnsi"/>
-        </w:rPr>
-        <w:t>day</w:t>
-      </w:r>
-      <w:proofErr w:type="spellEnd"/>
-      <w:r>
-        <w:rPr>
-          <w:rFonts w:cstheme="minorHAnsi"/>
-        </w:rPr>
-        <w:t xml:space="preserve"> in </w:t>
-      </w:r>
-      <w:proofErr w:type="spellStart"/>
-      <w:r>
-        <w:rPr>
-          <w:rFonts w:cstheme="minorHAnsi"/>
-        </w:rPr>
-        <w:t>the</w:t>
-      </w:r>
-      <w:proofErr w:type="spellEnd"/>
-      <w:r>
-        <w:rPr>
-          <w:rFonts w:cstheme="minorHAnsi"/>
-        </w:rPr>
-        <w:t xml:space="preserve"> </w:t>
-      </w:r>
-      <w:proofErr w:type="spellStart"/>
-      <w:r>
-        <w:rPr>
-          <w:rFonts w:cstheme="minorHAnsi"/>
-        </w:rPr>
-        <w:t>field</w:t>
+        <w:t>images</w:t>
+      </w:r>
+      <w:proofErr w:type="spellEnd"/>
+      <w:r>
+        <w:rPr>
+          <w:rFonts w:cstheme="minorHAnsi"/>
+        </w:rPr>
+        <w:t xml:space="preserve"> </w:t>
+      </w:r>
+      <w:proofErr w:type="spellStart"/>
+      <w:r>
+        <w:rPr>
+          <w:rFonts w:cstheme="minorHAnsi"/>
+        </w:rPr>
+        <w:t>where</w:t>
+      </w:r>
+      <w:proofErr w:type="spellEnd"/>
+      <w:r>
+        <w:rPr>
+          <w:rFonts w:cstheme="minorHAnsi"/>
+        </w:rPr>
+        <w:t xml:space="preserve"> </w:t>
+      </w:r>
+      <w:proofErr w:type="spellStart"/>
+      <w:r>
+        <w:rPr>
+          <w:rFonts w:cstheme="minorHAnsi"/>
+        </w:rPr>
+        <w:t>analysed</w:t>
+      </w:r>
+      <w:proofErr w:type="spellEnd"/>
+      <w:r>
+        <w:rPr>
+          <w:rFonts w:cstheme="minorHAnsi"/>
+        </w:rPr>
+        <w:t xml:space="preserve"> </w:t>
+      </w:r>
+      <w:proofErr w:type="spellStart"/>
+      <w:r>
+        <w:rPr>
+          <w:rFonts w:cstheme="minorHAnsi"/>
+        </w:rPr>
+        <w:t>using</w:t>
+      </w:r>
+      <w:proofErr w:type="spellEnd"/>
+      <w:r>
+        <w:rPr>
+          <w:rFonts w:cstheme="minorHAnsi"/>
+        </w:rPr>
+        <w:t xml:space="preserve"> </w:t>
+      </w:r>
+      <w:proofErr w:type="spellStart"/>
+      <w:r>
+        <w:rPr>
+          <w:rFonts w:cstheme="minorHAnsi"/>
+        </w:rPr>
+        <w:t>WinDIAS</w:t>
+      </w:r>
+      <w:proofErr w:type="spellEnd"/>
+      <w:r>
+        <w:rPr>
+          <w:rFonts w:cstheme="minorHAnsi"/>
+        </w:rPr>
+        <w:t xml:space="preserve"> software v3.3 (Delta-T </w:t>
+      </w:r>
+      <w:proofErr w:type="spellStart"/>
+      <w:r>
+        <w:rPr>
+          <w:rFonts w:cstheme="minorHAnsi"/>
+        </w:rPr>
+        <w:t>Devices</w:t>
       </w:r>
       <w:proofErr w:type="spellEnd"/>
       <w:r>
@@ -1523,834 +1954,73 @@
         <w:rPr>
           <w:rFonts w:cstheme="minorHAnsi"/>
         </w:rPr>
-        <w:t>kept</w:t>
-      </w:r>
-      <w:proofErr w:type="spellEnd"/>
-      <w:r>
-        <w:rPr>
-          <w:rFonts w:cstheme="minorHAnsi"/>
-        </w:rPr>
-        <w:t xml:space="preserve"> in </w:t>
-      </w:r>
-      <w:proofErr w:type="spellStart"/>
-      <w:r>
-        <w:rPr>
-          <w:rFonts w:cstheme="minorHAnsi"/>
-        </w:rPr>
-        <w:t>sealed</w:t>
-      </w:r>
-      <w:proofErr w:type="spellEnd"/>
-      <w:r>
-        <w:rPr>
-          <w:rFonts w:cstheme="minorHAnsi"/>
-        </w:rPr>
-        <w:t xml:space="preserve"> </w:t>
-      </w:r>
-      <w:proofErr w:type="spellStart"/>
-      <w:r>
-        <w:rPr>
-          <w:rFonts w:cstheme="minorHAnsi"/>
-        </w:rPr>
-        <w:t>plastic</w:t>
-      </w:r>
-      <w:proofErr w:type="spellEnd"/>
-      <w:r>
-        <w:rPr>
-          <w:rFonts w:cstheme="minorHAnsi"/>
-        </w:rPr>
-        <w:t xml:space="preserve"> </w:t>
-      </w:r>
-      <w:proofErr w:type="spellStart"/>
-      <w:r>
-        <w:rPr>
-          <w:rFonts w:cstheme="minorHAnsi"/>
-        </w:rPr>
-        <w:t>bags</w:t>
-      </w:r>
-      <w:proofErr w:type="spellEnd"/>
-      <w:r>
-        <w:rPr>
-          <w:rFonts w:cstheme="minorHAnsi"/>
-        </w:rPr>
-        <w:t xml:space="preserve"> </w:t>
-      </w:r>
-      <w:proofErr w:type="spellStart"/>
-      <w:r>
-        <w:rPr>
-          <w:rFonts w:cstheme="minorHAnsi"/>
-        </w:rPr>
-        <w:t>with</w:t>
-      </w:r>
-      <w:proofErr w:type="spellEnd"/>
-      <w:r>
-        <w:rPr>
-          <w:rFonts w:cstheme="minorHAnsi"/>
-        </w:rPr>
-        <w:t xml:space="preserve"> </w:t>
-      </w:r>
-      <w:proofErr w:type="spellStart"/>
-      <w:r>
-        <w:rPr>
-          <w:rFonts w:cstheme="minorHAnsi"/>
-        </w:rPr>
-        <w:t>moist</w:t>
-      </w:r>
-      <w:proofErr w:type="spellEnd"/>
-      <w:r>
-        <w:rPr>
-          <w:rFonts w:cstheme="minorHAnsi"/>
-        </w:rPr>
-        <w:t xml:space="preserve"> paper </w:t>
-      </w:r>
-      <w:proofErr w:type="spellStart"/>
-      <w:r>
-        <w:rPr>
-          <w:rFonts w:cstheme="minorHAnsi"/>
-        </w:rPr>
-        <w:t>until</w:t>
-      </w:r>
-      <w:proofErr w:type="spellEnd"/>
-      <w:r>
-        <w:rPr>
-          <w:rFonts w:cstheme="minorHAnsi"/>
-        </w:rPr>
-        <w:t xml:space="preserve"> </w:t>
-      </w:r>
-      <w:proofErr w:type="spellStart"/>
-      <w:r>
-        <w:rPr>
-          <w:rFonts w:cstheme="minorHAnsi"/>
-        </w:rPr>
-        <w:t>further</w:t>
-      </w:r>
-      <w:proofErr w:type="spellEnd"/>
-      <w:r>
-        <w:rPr>
-          <w:rFonts w:cstheme="minorHAnsi"/>
-        </w:rPr>
-        <w:t xml:space="preserve"> </w:t>
-      </w:r>
-      <w:proofErr w:type="spellStart"/>
-      <w:r>
-        <w:rPr>
-          <w:rFonts w:cstheme="minorHAnsi"/>
-        </w:rPr>
-        <w:t>processing</w:t>
-      </w:r>
-      <w:proofErr w:type="spellEnd"/>
-      <w:r>
-        <w:rPr>
-          <w:rFonts w:cstheme="minorHAnsi"/>
-        </w:rPr>
-        <w:t xml:space="preserve"> in </w:t>
-      </w:r>
-      <w:proofErr w:type="spellStart"/>
-      <w:r>
-        <w:rPr>
-          <w:rFonts w:cstheme="minorHAnsi"/>
-        </w:rPr>
-        <w:t>the</w:t>
-      </w:r>
-      <w:proofErr w:type="spellEnd"/>
-      <w:r>
-        <w:rPr>
-          <w:rFonts w:cstheme="minorHAnsi"/>
-        </w:rPr>
-        <w:t xml:space="preserve"> </w:t>
-      </w:r>
-      <w:proofErr w:type="spellStart"/>
-      <w:r>
-        <w:rPr>
-          <w:rFonts w:cstheme="minorHAnsi"/>
-        </w:rPr>
-        <w:t>laboratory</w:t>
-      </w:r>
-      <w:proofErr w:type="spellEnd"/>
-      <w:r>
-        <w:rPr>
-          <w:rFonts w:cstheme="minorHAnsi"/>
-        </w:rPr>
-        <w:t xml:space="preserve">. </w:t>
-      </w:r>
-      <w:proofErr w:type="spellStart"/>
-      <w:r>
-        <w:rPr>
-          <w:rFonts w:cstheme="minorHAnsi"/>
-        </w:rPr>
-        <w:t>Fresh</w:t>
-      </w:r>
-      <w:proofErr w:type="spellEnd"/>
-      <w:r>
-        <w:rPr>
-          <w:rFonts w:cstheme="minorHAnsi"/>
-        </w:rPr>
-        <w:t xml:space="preserve"> </w:t>
-      </w:r>
-      <w:proofErr w:type="spellStart"/>
-      <w:r>
-        <w:rPr>
-          <w:rFonts w:cstheme="minorHAnsi"/>
-        </w:rPr>
-        <w:t>weight</w:t>
-      </w:r>
-      <w:proofErr w:type="spellEnd"/>
-      <w:r>
-        <w:rPr>
-          <w:rFonts w:cstheme="minorHAnsi"/>
-        </w:rPr>
-        <w:t xml:space="preserve"> </w:t>
-      </w:r>
-      <w:proofErr w:type="spellStart"/>
-      <w:r>
-        <w:rPr>
-          <w:rFonts w:cstheme="minorHAnsi"/>
-        </w:rPr>
-        <w:t>was</w:t>
-      </w:r>
-      <w:proofErr w:type="spellEnd"/>
-      <w:r>
-        <w:rPr>
-          <w:rFonts w:cstheme="minorHAnsi"/>
-        </w:rPr>
-        <w:t xml:space="preserve"> </w:t>
-      </w:r>
-      <w:proofErr w:type="spellStart"/>
-      <w:r>
-        <w:rPr>
-          <w:rFonts w:cstheme="minorHAnsi"/>
-        </w:rPr>
-        <w:t>measured</w:t>
-      </w:r>
-      <w:proofErr w:type="spellEnd"/>
-      <w:r>
-        <w:rPr>
-          <w:rFonts w:cstheme="minorHAnsi"/>
-        </w:rPr>
-        <w:t xml:space="preserve"> (</w:t>
-      </w:r>
-      <w:proofErr w:type="spellStart"/>
-      <w:r>
-        <w:rPr>
-          <w:rFonts w:cstheme="minorHAnsi"/>
-        </w:rPr>
-        <w:t>Me</w:t>
+        <w:t>WinDias</w:t>
+      </w:r>
+      <w:proofErr w:type="spellEnd"/>
+      <w:r>
+        <w:rPr>
+          <w:rFonts w:cstheme="minorHAnsi"/>
+        </w:rPr>
+        <w:t xml:space="preserve"> </w:t>
+      </w:r>
+      <w:proofErr w:type="spellStart"/>
+      <w:r>
+        <w:rPr>
+          <w:rFonts w:cstheme="minorHAnsi"/>
+        </w:rPr>
+        <w:t>Leaf</w:t>
+      </w:r>
+      <w:proofErr w:type="spellEnd"/>
+      <w:r>
+        <w:rPr>
+          <w:rFonts w:cstheme="minorHAnsi"/>
+        </w:rPr>
+        <w:t xml:space="preserve"> </w:t>
+      </w:r>
+      <w:proofErr w:type="spellStart"/>
+      <w:r>
+        <w:rPr>
+          <w:rFonts w:cstheme="minorHAnsi"/>
+        </w:rPr>
+        <w:t>Image</w:t>
+      </w:r>
+      <w:proofErr w:type="spellEnd"/>
+      <w:r>
+        <w:rPr>
+          <w:rFonts w:cstheme="minorHAnsi"/>
+        </w:rPr>
+        <w:t xml:space="preserve"> </w:t>
+      </w:r>
+      <w:proofErr w:type="spellStart"/>
+      <w:r>
+        <w:rPr>
+          <w:rFonts w:cstheme="minorHAnsi"/>
+        </w:rPr>
+        <w:t>Analysis</w:t>
+      </w:r>
+      <w:proofErr w:type="spellEnd"/>
+      <w:r>
+        <w:rPr>
+          <w:rFonts w:cstheme="minorHAnsi"/>
+        </w:rPr>
+        <w:t xml:space="preserve"> System </w:t>
+      </w:r>
+      <w:proofErr w:type="spellStart"/>
+      <w:r>
+        <w:rPr>
+          <w:rFonts w:cstheme="minorHAnsi"/>
+        </w:rPr>
+        <w:t>version</w:t>
+      </w:r>
+      <w:proofErr w:type="spellEnd"/>
+      <w:r>
+        <w:rPr>
+          <w:rFonts w:cstheme="minorHAnsi"/>
+        </w:rPr>
+        <w:t xml:space="preserve"> 3.3). </w:t>
       </w:r>
       <w:bookmarkStart w:id="0" w:name="_GoBack"/>
       <w:bookmarkEnd w:id="0"/>
-      <w:r>
-        <w:rPr>
-          <w:rFonts w:cstheme="minorHAnsi"/>
-        </w:rPr>
-        <w:t>ttler</w:t>
-      </w:r>
-      <w:proofErr w:type="spellEnd"/>
-      <w:r>
-        <w:rPr>
-          <w:rFonts w:cstheme="minorHAnsi"/>
-        </w:rPr>
-        <w:t xml:space="preserve"> Toledo, New </w:t>
-      </w:r>
-      <w:proofErr w:type="spellStart"/>
-      <w:r>
-        <w:rPr>
-          <w:rFonts w:cstheme="minorHAnsi"/>
-        </w:rPr>
-        <w:t>classic</w:t>
-      </w:r>
-      <w:proofErr w:type="spellEnd"/>
-      <w:r>
-        <w:rPr>
-          <w:rFonts w:cstheme="minorHAnsi"/>
-        </w:rPr>
-        <w:t xml:space="preserve"> SG – Model ML1052E/01, </w:t>
-      </w:r>
-      <w:proofErr w:type="spellStart"/>
-      <w:r>
-        <w:rPr>
-          <w:rFonts w:cstheme="minorHAnsi"/>
-        </w:rPr>
-        <w:t>precision</w:t>
-      </w:r>
-      <w:proofErr w:type="spellEnd"/>
-      <w:r>
-        <w:rPr>
-          <w:rFonts w:cstheme="minorHAnsi"/>
-        </w:rPr>
-        <w:t xml:space="preserve"> 0.1 mg), </w:t>
-      </w:r>
-      <w:proofErr w:type="spellStart"/>
-      <w:r>
-        <w:rPr>
-          <w:rFonts w:cstheme="minorHAnsi"/>
-        </w:rPr>
-        <w:t>removing</w:t>
-      </w:r>
-      <w:proofErr w:type="spellEnd"/>
-      <w:r>
-        <w:rPr>
-          <w:rFonts w:cstheme="minorHAnsi"/>
-        </w:rPr>
-        <w:t xml:space="preserve"> any visible </w:t>
-      </w:r>
-      <w:proofErr w:type="spellStart"/>
-      <w:r>
-        <w:rPr>
-          <w:rFonts w:cstheme="minorHAnsi"/>
-        </w:rPr>
-        <w:t>droplets</w:t>
-      </w:r>
-      <w:proofErr w:type="spellEnd"/>
-      <w:r>
-        <w:rPr>
-          <w:rFonts w:cstheme="minorHAnsi"/>
-        </w:rPr>
-        <w:t xml:space="preserve"> of </w:t>
-      </w:r>
-      <w:proofErr w:type="spellStart"/>
-      <w:r>
-        <w:rPr>
-          <w:rFonts w:cstheme="minorHAnsi"/>
-        </w:rPr>
-        <w:t>water</w:t>
-      </w:r>
-      <w:proofErr w:type="spellEnd"/>
-      <w:r>
-        <w:rPr>
-          <w:rFonts w:cstheme="minorHAnsi"/>
-        </w:rPr>
-        <w:t xml:space="preserve">, </w:t>
-      </w:r>
-      <w:proofErr w:type="spellStart"/>
-      <w:r>
-        <w:rPr>
-          <w:rFonts w:cstheme="minorHAnsi"/>
-        </w:rPr>
-        <w:t>then</w:t>
-      </w:r>
-      <w:proofErr w:type="spellEnd"/>
-      <w:r>
-        <w:rPr>
-          <w:rFonts w:cstheme="minorHAnsi"/>
-        </w:rPr>
-        <w:t xml:space="preserve"> </w:t>
-      </w:r>
-      <w:proofErr w:type="spellStart"/>
-      <w:r>
-        <w:rPr>
-          <w:rFonts w:cstheme="minorHAnsi"/>
-        </w:rPr>
-        <w:t>leaves</w:t>
-      </w:r>
-      <w:proofErr w:type="spellEnd"/>
-      <w:r>
-        <w:rPr>
-          <w:rFonts w:cstheme="minorHAnsi"/>
-        </w:rPr>
-        <w:t xml:space="preserve"> </w:t>
-      </w:r>
-      <w:proofErr w:type="spellStart"/>
-      <w:r>
-        <w:rPr>
-          <w:rFonts w:cstheme="minorHAnsi"/>
-        </w:rPr>
-        <w:t>were</w:t>
-      </w:r>
-      <w:proofErr w:type="spellEnd"/>
-      <w:r>
-        <w:rPr>
-          <w:rFonts w:cstheme="minorHAnsi"/>
-        </w:rPr>
-        <w:t xml:space="preserve"> </w:t>
-      </w:r>
-      <w:proofErr w:type="spellStart"/>
-      <w:r>
-        <w:rPr>
-          <w:rFonts w:cstheme="minorHAnsi"/>
-        </w:rPr>
-        <w:t>scanned</w:t>
-      </w:r>
-      <w:proofErr w:type="spellEnd"/>
-      <w:r>
-        <w:rPr>
-          <w:rFonts w:cstheme="minorHAnsi"/>
-        </w:rPr>
-        <w:t xml:space="preserve"> </w:t>
-      </w:r>
-      <w:proofErr w:type="spellStart"/>
-      <w:r>
-        <w:rPr>
-          <w:rFonts w:cstheme="minorHAnsi"/>
-        </w:rPr>
-        <w:t>with</w:t>
-      </w:r>
-      <w:proofErr w:type="spellEnd"/>
-      <w:r>
-        <w:rPr>
-          <w:rFonts w:cstheme="minorHAnsi"/>
-        </w:rPr>
-        <w:t xml:space="preserve"> Epson </w:t>
-      </w:r>
-      <w:proofErr w:type="spellStart"/>
-      <w:r>
-        <w:rPr>
-          <w:rFonts w:cstheme="minorHAnsi"/>
-        </w:rPr>
-        <w:t>Canon</w:t>
-      </w:r>
-      <w:proofErr w:type="spellEnd"/>
-      <w:r>
-        <w:rPr>
-          <w:rFonts w:cstheme="minorHAnsi"/>
-        </w:rPr>
-        <w:t xml:space="preserve"> </w:t>
-      </w:r>
-      <w:proofErr w:type="spellStart"/>
-      <w:r>
-        <w:rPr>
-          <w:rFonts w:cstheme="minorHAnsi"/>
-        </w:rPr>
-        <w:t>scanner</w:t>
-      </w:r>
-      <w:proofErr w:type="spellEnd"/>
-      <w:r>
-        <w:rPr>
-          <w:rFonts w:cstheme="minorHAnsi"/>
-        </w:rPr>
-        <w:t xml:space="preserve"> (</w:t>
-      </w:r>
-      <w:r>
-        <w:rPr>
-          <w:rFonts w:cstheme="minorHAnsi"/>
-          <w:highlight w:val="yellow"/>
-        </w:rPr>
-        <w:t>REF</w:t>
-      </w:r>
-      <w:r>
-        <w:rPr>
-          <w:rFonts w:cstheme="minorHAnsi"/>
-        </w:rPr>
-        <w:t xml:space="preserve">) </w:t>
-      </w:r>
-      <w:proofErr w:type="spellStart"/>
-      <w:r>
-        <w:rPr>
-          <w:rFonts w:cstheme="minorHAnsi"/>
-        </w:rPr>
-        <w:t>at</w:t>
-      </w:r>
-      <w:proofErr w:type="spellEnd"/>
-      <w:r>
-        <w:rPr>
-          <w:rFonts w:cstheme="minorHAnsi"/>
-        </w:rPr>
-        <w:t xml:space="preserve"> 600 </w:t>
-      </w:r>
-      <w:proofErr w:type="spellStart"/>
-      <w:r>
-        <w:rPr>
-          <w:rFonts w:cstheme="minorHAnsi"/>
-        </w:rPr>
-        <w:t>dpi</w:t>
-      </w:r>
-      <w:proofErr w:type="spellEnd"/>
-      <w:r>
-        <w:rPr>
-          <w:rFonts w:cstheme="minorHAnsi"/>
-        </w:rPr>
-        <w:t xml:space="preserve"> </w:t>
-      </w:r>
-      <w:proofErr w:type="spellStart"/>
-      <w:r>
-        <w:rPr>
-          <w:rFonts w:cstheme="minorHAnsi"/>
-        </w:rPr>
-        <w:t>and</w:t>
-      </w:r>
-      <w:proofErr w:type="spellEnd"/>
-      <w:r>
-        <w:rPr>
-          <w:rFonts w:cstheme="minorHAnsi"/>
-        </w:rPr>
-        <w:t xml:space="preserve"> </w:t>
-      </w:r>
-      <w:proofErr w:type="spellStart"/>
-      <w:r>
-        <w:rPr>
-          <w:rFonts w:cstheme="minorHAnsi"/>
-        </w:rPr>
-        <w:t>finally</w:t>
-      </w:r>
-      <w:proofErr w:type="spellEnd"/>
-      <w:r>
-        <w:rPr>
-          <w:rFonts w:cstheme="minorHAnsi"/>
-        </w:rPr>
-        <w:t xml:space="preserve"> </w:t>
-      </w:r>
-      <w:proofErr w:type="spellStart"/>
-      <w:r>
-        <w:rPr>
-          <w:rFonts w:cstheme="minorHAnsi"/>
-        </w:rPr>
-        <w:t>leaves</w:t>
-      </w:r>
-      <w:proofErr w:type="spellEnd"/>
-      <w:r>
-        <w:rPr>
-          <w:rFonts w:cstheme="minorHAnsi"/>
-        </w:rPr>
-        <w:t xml:space="preserve"> </w:t>
-      </w:r>
-      <w:proofErr w:type="spellStart"/>
-      <w:r>
-        <w:rPr>
-          <w:rFonts w:cstheme="minorHAnsi"/>
-        </w:rPr>
-        <w:t>were</w:t>
-      </w:r>
-      <w:proofErr w:type="spellEnd"/>
-      <w:r>
-        <w:rPr>
-          <w:rFonts w:cstheme="minorHAnsi"/>
-        </w:rPr>
-        <w:t xml:space="preserve"> put in </w:t>
-      </w:r>
-      <w:proofErr w:type="spellStart"/>
-      <w:r>
-        <w:rPr>
-          <w:rFonts w:cstheme="minorHAnsi"/>
-        </w:rPr>
-        <w:t>the</w:t>
-      </w:r>
-      <w:proofErr w:type="spellEnd"/>
-      <w:r>
-        <w:rPr>
-          <w:rFonts w:cstheme="minorHAnsi"/>
-        </w:rPr>
-        <w:t xml:space="preserve"> </w:t>
-      </w:r>
-      <w:proofErr w:type="spellStart"/>
-      <w:r>
-        <w:rPr>
-          <w:rFonts w:cstheme="minorHAnsi"/>
-        </w:rPr>
-        <w:t>oven</w:t>
-      </w:r>
-      <w:proofErr w:type="spellEnd"/>
-      <w:r>
-        <w:rPr>
-          <w:rFonts w:cstheme="minorHAnsi"/>
-        </w:rPr>
-        <w:t xml:space="preserve"> </w:t>
-      </w:r>
-      <w:proofErr w:type="spellStart"/>
-      <w:r>
-        <w:rPr>
-          <w:rFonts w:cstheme="minorHAnsi"/>
-        </w:rPr>
-        <w:t>at</w:t>
-      </w:r>
-      <w:proofErr w:type="spellEnd"/>
-      <w:r>
-        <w:rPr>
-          <w:rFonts w:cstheme="minorHAnsi"/>
-        </w:rPr>
-        <w:t xml:space="preserve"> 70ºC for 72h to </w:t>
-      </w:r>
-      <w:proofErr w:type="spellStart"/>
-      <w:r>
-        <w:rPr>
-          <w:rFonts w:cstheme="minorHAnsi"/>
-        </w:rPr>
-        <w:t>lastly</w:t>
-      </w:r>
-      <w:proofErr w:type="spellEnd"/>
-      <w:r>
-        <w:rPr>
-          <w:rFonts w:cstheme="minorHAnsi"/>
-        </w:rPr>
-        <w:t xml:space="preserve"> </w:t>
-      </w:r>
-      <w:proofErr w:type="spellStart"/>
-      <w:r>
-        <w:rPr>
-          <w:rFonts w:cstheme="minorHAnsi"/>
-        </w:rPr>
-        <w:t>measure</w:t>
-      </w:r>
-      <w:proofErr w:type="spellEnd"/>
-      <w:r>
-        <w:rPr>
-          <w:rFonts w:cstheme="minorHAnsi"/>
-        </w:rPr>
-        <w:t xml:space="preserve"> </w:t>
-      </w:r>
-      <w:proofErr w:type="spellStart"/>
-      <w:r>
-        <w:rPr>
-          <w:rFonts w:cstheme="minorHAnsi"/>
-        </w:rPr>
-        <w:t>dry</w:t>
-      </w:r>
-      <w:proofErr w:type="spellEnd"/>
-      <w:r>
-        <w:rPr>
-          <w:rFonts w:cstheme="minorHAnsi"/>
-        </w:rPr>
-        <w:t xml:space="preserve"> </w:t>
-      </w:r>
-      <w:proofErr w:type="spellStart"/>
-      <w:r>
-        <w:rPr>
-          <w:rFonts w:cstheme="minorHAnsi"/>
-        </w:rPr>
-        <w:t>weight</w:t>
-      </w:r>
-      <w:proofErr w:type="spellEnd"/>
-      <w:r>
-        <w:rPr>
-          <w:rFonts w:cstheme="minorHAnsi"/>
-        </w:rPr>
-        <w:t xml:space="preserve">. </w:t>
-      </w:r>
-      <w:proofErr w:type="spellStart"/>
-      <w:r>
-        <w:rPr>
-          <w:rFonts w:cstheme="minorHAnsi"/>
-        </w:rPr>
-        <w:t>Leaves</w:t>
-      </w:r>
-      <w:proofErr w:type="spellEnd"/>
-      <w:r>
-        <w:rPr>
-          <w:rFonts w:cstheme="minorHAnsi"/>
-        </w:rPr>
-        <w:t xml:space="preserve"> </w:t>
-      </w:r>
-      <w:proofErr w:type="spellStart"/>
-      <w:r>
-        <w:rPr>
-          <w:rFonts w:cstheme="minorHAnsi"/>
-        </w:rPr>
-        <w:t>images</w:t>
-      </w:r>
-      <w:proofErr w:type="spellEnd"/>
-      <w:r>
-        <w:rPr>
-          <w:rFonts w:cstheme="minorHAnsi"/>
-        </w:rPr>
-        <w:t xml:space="preserve"> </w:t>
-      </w:r>
-      <w:proofErr w:type="spellStart"/>
-      <w:r>
-        <w:rPr>
-          <w:rFonts w:cstheme="minorHAnsi"/>
-        </w:rPr>
-        <w:t>where</w:t>
-      </w:r>
-      <w:proofErr w:type="spellEnd"/>
-      <w:r>
-        <w:rPr>
-          <w:rFonts w:cstheme="minorHAnsi"/>
-        </w:rPr>
-        <w:t xml:space="preserve"> </w:t>
-      </w:r>
-      <w:proofErr w:type="spellStart"/>
-      <w:r>
-        <w:rPr>
-          <w:rFonts w:cstheme="minorHAnsi"/>
-        </w:rPr>
-        <w:t>analysed</w:t>
-      </w:r>
-      <w:proofErr w:type="spellEnd"/>
-      <w:r>
-        <w:rPr>
-          <w:rFonts w:cstheme="minorHAnsi"/>
-        </w:rPr>
-        <w:t xml:space="preserve"> </w:t>
-      </w:r>
-      <w:proofErr w:type="spellStart"/>
-      <w:r>
-        <w:rPr>
-          <w:rFonts w:cstheme="minorHAnsi"/>
-        </w:rPr>
-        <w:t>using</w:t>
-      </w:r>
-      <w:proofErr w:type="spellEnd"/>
-      <w:r>
-        <w:rPr>
-          <w:rFonts w:cstheme="minorHAnsi"/>
-        </w:rPr>
-        <w:t xml:space="preserve"> </w:t>
-      </w:r>
-      <w:proofErr w:type="spellStart"/>
-      <w:r>
-        <w:rPr>
-          <w:rFonts w:cstheme="minorHAnsi"/>
-        </w:rPr>
-        <w:t>WinDIAS</w:t>
-      </w:r>
-      <w:proofErr w:type="spellEnd"/>
-      <w:r>
-        <w:rPr>
-          <w:rFonts w:cstheme="minorHAnsi"/>
-        </w:rPr>
-        <w:t xml:space="preserve"> software v3.3 (Delta-T </w:t>
-      </w:r>
-      <w:proofErr w:type="spellStart"/>
-      <w:r>
-        <w:rPr>
-          <w:rFonts w:cstheme="minorHAnsi"/>
-        </w:rPr>
-        <w:t>Devices</w:t>
-      </w:r>
-      <w:proofErr w:type="spellEnd"/>
-      <w:r>
-        <w:rPr>
-          <w:rFonts w:cstheme="minorHAnsi"/>
-        </w:rPr>
-        <w:t xml:space="preserve">, </w:t>
-      </w:r>
-      <w:proofErr w:type="spellStart"/>
-      <w:r>
-        <w:rPr>
-          <w:rFonts w:cstheme="minorHAnsi"/>
-        </w:rPr>
-        <w:t>WinDias</w:t>
-      </w:r>
-      <w:proofErr w:type="spellEnd"/>
-      <w:r>
-        <w:rPr>
-          <w:rFonts w:cstheme="minorHAnsi"/>
-        </w:rPr>
-        <w:t xml:space="preserve"> </w:t>
-      </w:r>
-      <w:proofErr w:type="spellStart"/>
-      <w:r>
-        <w:rPr>
-          <w:rFonts w:cstheme="minorHAnsi"/>
-        </w:rPr>
-        <w:t>Leaf</w:t>
-      </w:r>
-      <w:proofErr w:type="spellEnd"/>
-      <w:r>
-        <w:rPr>
-          <w:rFonts w:cstheme="minorHAnsi"/>
-        </w:rPr>
-        <w:t xml:space="preserve"> </w:t>
-      </w:r>
-      <w:proofErr w:type="spellStart"/>
-      <w:r>
-        <w:rPr>
-          <w:rFonts w:cstheme="minorHAnsi"/>
-        </w:rPr>
-        <w:t>Image</w:t>
-      </w:r>
-      <w:proofErr w:type="spellEnd"/>
-      <w:r>
-        <w:rPr>
-          <w:rFonts w:cstheme="minorHAnsi"/>
-        </w:rPr>
-        <w:t xml:space="preserve"> </w:t>
-      </w:r>
-      <w:proofErr w:type="spellStart"/>
-      <w:r>
-        <w:rPr>
-          <w:rFonts w:cstheme="minorHAnsi"/>
-        </w:rPr>
-        <w:t>Analysis</w:t>
-      </w:r>
-      <w:proofErr w:type="spellEnd"/>
-      <w:r>
-        <w:rPr>
-          <w:rFonts w:cstheme="minorHAnsi"/>
-        </w:rPr>
-        <w:t xml:space="preserve"> System </w:t>
-      </w:r>
-      <w:proofErr w:type="spellStart"/>
-      <w:r>
-        <w:rPr>
-          <w:rFonts w:cstheme="minorHAnsi"/>
-        </w:rPr>
-        <w:t>version</w:t>
-      </w:r>
-      <w:proofErr w:type="spellEnd"/>
-      <w:r>
-        <w:rPr>
-          <w:rFonts w:cstheme="minorHAnsi"/>
-        </w:rPr>
-        <w:t xml:space="preserve"> 3.3). </w:t>
-      </w:r>
-      <w:proofErr w:type="spellStart"/>
-      <w:r>
-        <w:rPr>
-          <w:rFonts w:cstheme="minorHAnsi"/>
-        </w:rPr>
-        <w:t>Exploration</w:t>
-      </w:r>
-      <w:proofErr w:type="spellEnd"/>
-      <w:r>
-        <w:rPr>
-          <w:rFonts w:cstheme="minorHAnsi"/>
-        </w:rPr>
-        <w:t xml:space="preserve"> of </w:t>
-      </w:r>
-      <w:proofErr w:type="spellStart"/>
-      <w:r>
-        <w:rPr>
-          <w:rFonts w:cstheme="minorHAnsi"/>
-        </w:rPr>
-        <w:t>trait</w:t>
-      </w:r>
-      <w:proofErr w:type="spellEnd"/>
-      <w:r>
-        <w:rPr>
-          <w:rFonts w:cstheme="minorHAnsi"/>
-        </w:rPr>
-        <w:t xml:space="preserve"> data can be </w:t>
-      </w:r>
-      <w:proofErr w:type="spellStart"/>
-      <w:r>
-        <w:rPr>
-          <w:rFonts w:cstheme="minorHAnsi"/>
-        </w:rPr>
-        <w:t>visualized</w:t>
-      </w:r>
-      <w:proofErr w:type="spellEnd"/>
-      <w:r>
-        <w:rPr>
-          <w:rFonts w:cstheme="minorHAnsi"/>
-        </w:rPr>
-        <w:t xml:space="preserve"> in </w:t>
-      </w:r>
-      <w:proofErr w:type="spellStart"/>
-      <w:r>
-        <w:rPr>
-          <w:rFonts w:cstheme="minorHAnsi"/>
-        </w:rPr>
-        <w:t>figure</w:t>
-      </w:r>
-      <w:proofErr w:type="spellEnd"/>
-      <w:r>
-        <w:rPr>
-          <w:rFonts w:cstheme="minorHAnsi"/>
-        </w:rPr>
-        <w:t xml:space="preserve"> 1 </w:t>
-      </w:r>
-      <w:proofErr w:type="spellStart"/>
-      <w:r>
-        <w:rPr>
-          <w:rFonts w:cstheme="minorHAnsi"/>
-        </w:rPr>
-        <w:t>lower</w:t>
-      </w:r>
-      <w:proofErr w:type="spellEnd"/>
-      <w:r>
-        <w:rPr>
-          <w:rFonts w:cstheme="minorHAnsi"/>
-        </w:rPr>
-        <w:t xml:space="preserve"> panels.</w:t>
-      </w:r>
     </w:p>
     <w:p>
       <w:pPr>

</xml_diff>